<commit_message>
Update employee attrition analysis report
</commit_message>
<xml_diff>
--- a/Employee Attrition Analysis/reports/Employee Attrition Analysis.docx
+++ b/Employee Attrition Analysis/reports/Employee Attrition Analysis.docx
@@ -7977,7 +7977,6 @@
     <w:p>
       <w:pPr>
         <w:spacing w:line="240" w:lineRule="auto"/>
-        <w:jc w:val="center"/>
         <w:rPr>
           <w:rFonts w:ascii="Times New Roman" w:hAnsi="Times New Roman" w:cs="Times New Roman"/>
           <w:b/>
@@ -7990,7 +7989,6 @@
     <w:p>
       <w:pPr>
         <w:spacing w:line="240" w:lineRule="auto"/>
-        <w:jc w:val="center"/>
         <w:rPr>
           <w:rFonts w:ascii="Times New Roman" w:hAnsi="Times New Roman" w:cs="Times New Roman"/>
           <w:b/>
@@ -8008,6 +8006,530 @@
           <w:szCs w:val="28"/>
         </w:rPr>
         <w:lastRenderedPageBreak/>
+        <w:t>Dashboard Interpretation: Relationship with Employee Attrition</w:t>
+      </w:r>
+    </w:p>
+    <w:p>
+      <w:pPr>
+        <w:spacing w:line="240" w:lineRule="auto"/>
+        <w:jc w:val="both"/>
+        <w:rPr>
+          <w:rFonts w:ascii="Times New Roman" w:hAnsi="Times New Roman" w:cs="Times New Roman"/>
+          <w:sz w:val="24"/>
+          <w:szCs w:val="24"/>
+        </w:rPr>
+      </w:pPr>
+      <w:r>
+        <w:rPr>
+          <w:rFonts w:ascii="Times New Roman" w:hAnsi="Times New Roman" w:cs="Times New Roman"/>
+          <w:sz w:val="24"/>
+          <w:szCs w:val="24"/>
+        </w:rPr>
+        <w:t>The Tableau dashboard provides an overview of employee attrition using key performance indicators (KPIs) and visualizations of different employee groups. The KPIs summarize the overall workforce, while the charts help identify employee segments with higher observed attrition rates.</w:t>
+      </w:r>
+    </w:p>
+    <w:p>
+      <w:pPr>
+        <w:spacing w:line="240" w:lineRule="auto"/>
+        <w:jc w:val="both"/>
+        <w:rPr>
+          <w:rFonts w:ascii="Times New Roman" w:hAnsi="Times New Roman" w:cs="Times New Roman"/>
+          <w:b/>
+          <w:bCs/>
+          <w:sz w:val="28"/>
+          <w:szCs w:val="28"/>
+        </w:rPr>
+      </w:pPr>
+      <w:r>
+        <w:rPr>
+          <w:rFonts w:ascii="Times New Roman" w:hAnsi="Times New Roman" w:cs="Times New Roman"/>
+          <w:b/>
+          <w:bCs/>
+          <w:sz w:val="28"/>
+          <w:szCs w:val="28"/>
+        </w:rPr>
+        <w:t>1. KPI Interpretation</w:t>
+      </w:r>
+    </w:p>
+    <w:p>
+      <w:pPr>
+        <w:numPr>
+          <w:ilvl w:val="0"/>
+          <w:numId w:val="14"/>
+        </w:numPr>
+        <w:spacing w:after="0" w:line="240" w:lineRule="auto"/>
+        <w:jc w:val="both"/>
+        <w:rPr>
+          <w:rFonts w:ascii="Times New Roman" w:hAnsi="Times New Roman" w:cs="Times New Roman"/>
+          <w:sz w:val="24"/>
+          <w:szCs w:val="24"/>
+        </w:rPr>
+      </w:pPr>
+      <w:r>
+        <w:rPr>
+          <w:rFonts w:ascii="Times New Roman" w:hAnsi="Times New Roman" w:cs="Times New Roman"/>
+          <w:sz w:val="24"/>
+          <w:szCs w:val="24"/>
+        </w:rPr>
+        <w:t xml:space="preserve">Total Employees (1,470): Represents the total number of employee records </w:t>
+      </w:r>
+      <w:proofErr w:type="spellStart"/>
+      <w:r>
+        <w:rPr>
+          <w:rFonts w:ascii="Times New Roman" w:hAnsi="Times New Roman" w:cs="Times New Roman"/>
+          <w:sz w:val="24"/>
+          <w:szCs w:val="24"/>
+        </w:rPr>
+        <w:t>analyzed</w:t>
+      </w:r>
+      <w:proofErr w:type="spellEnd"/>
+      <w:r>
+        <w:rPr>
+          <w:rFonts w:ascii="Times New Roman" w:hAnsi="Times New Roman" w:cs="Times New Roman"/>
+          <w:sz w:val="24"/>
+          <w:szCs w:val="24"/>
+        </w:rPr>
+        <w:t xml:space="preserve"> and provides the base population for attrition analysis.</w:t>
+      </w:r>
+    </w:p>
+    <w:p>
+      <w:pPr>
+        <w:numPr>
+          <w:ilvl w:val="0"/>
+          <w:numId w:val="14"/>
+        </w:numPr>
+        <w:spacing w:after="0" w:line="240" w:lineRule="auto"/>
+        <w:jc w:val="both"/>
+        <w:rPr>
+          <w:rFonts w:ascii="Times New Roman" w:hAnsi="Times New Roman" w:cs="Times New Roman"/>
+          <w:sz w:val="24"/>
+          <w:szCs w:val="24"/>
+        </w:rPr>
+      </w:pPr>
+      <w:r>
+        <w:rPr>
+          <w:rFonts w:ascii="Times New Roman" w:hAnsi="Times New Roman" w:cs="Times New Roman"/>
+          <w:sz w:val="24"/>
+          <w:szCs w:val="24"/>
+        </w:rPr>
+        <w:t>Employees Who Left (237): Shows the number of employees who left the organization. This is the numerator used to calculate the overall attrition rate.</w:t>
+      </w:r>
+    </w:p>
+    <w:p>
+      <w:pPr>
+        <w:numPr>
+          <w:ilvl w:val="0"/>
+          <w:numId w:val="14"/>
+        </w:numPr>
+        <w:spacing w:after="0" w:line="240" w:lineRule="auto"/>
+        <w:jc w:val="both"/>
+        <w:rPr>
+          <w:rFonts w:ascii="Times New Roman" w:hAnsi="Times New Roman" w:cs="Times New Roman"/>
+          <w:sz w:val="24"/>
+          <w:szCs w:val="24"/>
+        </w:rPr>
+      </w:pPr>
+      <w:r>
+        <w:rPr>
+          <w:rFonts w:ascii="Times New Roman" w:hAnsi="Times New Roman" w:cs="Times New Roman"/>
+          <w:sz w:val="24"/>
+          <w:szCs w:val="24"/>
+        </w:rPr>
+        <w:t>Attrition Rate (16.12%): Indicates the percentage of employees who left out of the total workforce. It serves as the baseline for comparing attrition across employee segments.</w:t>
+      </w:r>
+    </w:p>
+    <w:p>
+      <w:pPr>
+        <w:numPr>
+          <w:ilvl w:val="0"/>
+          <w:numId w:val="14"/>
+        </w:numPr>
+        <w:spacing w:after="0" w:line="240" w:lineRule="auto"/>
+        <w:jc w:val="both"/>
+        <w:rPr>
+          <w:rFonts w:ascii="Times New Roman" w:hAnsi="Times New Roman" w:cs="Times New Roman"/>
+          <w:sz w:val="24"/>
+          <w:szCs w:val="24"/>
+        </w:rPr>
+      </w:pPr>
+      <w:r>
+        <w:rPr>
+          <w:rFonts w:ascii="Times New Roman" w:hAnsi="Times New Roman" w:cs="Times New Roman"/>
+          <w:sz w:val="24"/>
+          <w:szCs w:val="24"/>
+        </w:rPr>
+        <w:t>Average Monthly Income (6,503): Represents the average monthly income in the dataset. It provides compensation context when interpreting attrition patterns across salary groups.</w:t>
+      </w:r>
+    </w:p>
+    <w:p>
+      <w:pPr>
+        <w:numPr>
+          <w:ilvl w:val="0"/>
+          <w:numId w:val="14"/>
+        </w:numPr>
+        <w:spacing w:after="0" w:line="240" w:lineRule="auto"/>
+        <w:jc w:val="both"/>
+        <w:rPr>
+          <w:rFonts w:ascii="Times New Roman" w:hAnsi="Times New Roman" w:cs="Times New Roman"/>
+          <w:sz w:val="24"/>
+          <w:szCs w:val="24"/>
+        </w:rPr>
+      </w:pPr>
+      <w:r>
+        <w:rPr>
+          <w:rFonts w:ascii="Times New Roman" w:hAnsi="Times New Roman" w:cs="Times New Roman"/>
+          <w:sz w:val="24"/>
+          <w:szCs w:val="24"/>
+        </w:rPr>
+        <w:t>Average Age (36.92 years): Shows the average age of employees and provides demographic context for comparing attrition across age groups.</w:t>
+      </w:r>
+    </w:p>
+    <w:p>
+      <w:pPr>
+        <w:spacing w:line="240" w:lineRule="auto"/>
+        <w:jc w:val="both"/>
+        <w:rPr>
+          <w:rFonts w:ascii="Times New Roman" w:hAnsi="Times New Roman" w:cs="Times New Roman"/>
+          <w:b/>
+          <w:bCs/>
+          <w:sz w:val="28"/>
+          <w:szCs w:val="28"/>
+        </w:rPr>
+      </w:pPr>
+      <w:r>
+        <w:rPr>
+          <w:rFonts w:ascii="Times New Roman" w:hAnsi="Times New Roman" w:cs="Times New Roman"/>
+          <w:b/>
+          <w:bCs/>
+          <w:sz w:val="28"/>
+          <w:szCs w:val="28"/>
+        </w:rPr>
+        <w:t>2. Chart Interpretation</w:t>
+      </w:r>
+    </w:p>
+    <w:p>
+      <w:pPr>
+        <w:spacing w:after="0" w:line="240" w:lineRule="auto"/>
+        <w:jc w:val="both"/>
+        <w:rPr>
+          <w:rFonts w:ascii="Times New Roman" w:hAnsi="Times New Roman" w:cs="Times New Roman"/>
+          <w:sz w:val="24"/>
+          <w:szCs w:val="24"/>
+        </w:rPr>
+      </w:pPr>
+      <w:r>
+        <w:rPr>
+          <w:rFonts w:ascii="Times New Roman" w:hAnsi="Times New Roman" w:cs="Times New Roman"/>
+          <w:b/>
+          <w:bCs/>
+          <w:sz w:val="24"/>
+          <w:szCs w:val="24"/>
+        </w:rPr>
+        <w:t>Attrition by Department:</w:t>
+      </w:r>
+      <w:r>
+        <w:rPr>
+          <w:rFonts w:ascii="Times New Roman" w:hAnsi="Times New Roman" w:cs="Times New Roman"/>
+          <w:sz w:val="24"/>
+          <w:szCs w:val="24"/>
+        </w:rPr>
+        <w:t xml:space="preserve"> Sales had the highest observed attrition rate at 20.63%, followed by Human Resources at 19.05%. Research and Development had the lowest rate at 13.84%. This indicates that attrition varies across departments and may require department-specific investigation.</w:t>
+      </w:r>
+    </w:p>
+    <w:p>
+      <w:pPr>
+        <w:spacing w:after="0" w:line="240" w:lineRule="auto"/>
+        <w:jc w:val="both"/>
+        <w:rPr>
+          <w:rFonts w:ascii="Times New Roman" w:hAnsi="Times New Roman" w:cs="Times New Roman"/>
+          <w:sz w:val="24"/>
+          <w:szCs w:val="24"/>
+        </w:rPr>
+      </w:pPr>
+      <w:r>
+        <w:rPr>
+          <w:rFonts w:ascii="Times New Roman" w:hAnsi="Times New Roman" w:cs="Times New Roman"/>
+          <w:b/>
+          <w:bCs/>
+          <w:sz w:val="24"/>
+          <w:szCs w:val="24"/>
+        </w:rPr>
+        <w:t>Attrition by Overtime:</w:t>
+      </w:r>
+      <w:r>
+        <w:rPr>
+          <w:rFonts w:ascii="Times New Roman" w:hAnsi="Times New Roman" w:cs="Times New Roman"/>
+          <w:sz w:val="24"/>
+          <w:szCs w:val="24"/>
+        </w:rPr>
+        <w:t xml:space="preserve"> Employees who worked overtime had an attrition rate of 30.53%, compared with 10.44% among employees who did not work overtime. This difference highlights overtime and workload distribution as important areas for further investigation.</w:t>
+      </w:r>
+    </w:p>
+    <w:p>
+      <w:pPr>
+        <w:spacing w:after="0" w:line="240" w:lineRule="auto"/>
+        <w:jc w:val="both"/>
+        <w:rPr>
+          <w:rFonts w:ascii="Times New Roman" w:hAnsi="Times New Roman" w:cs="Times New Roman"/>
+          <w:sz w:val="24"/>
+          <w:szCs w:val="24"/>
+        </w:rPr>
+      </w:pPr>
+      <w:r>
+        <w:rPr>
+          <w:rFonts w:ascii="Times New Roman" w:hAnsi="Times New Roman" w:cs="Times New Roman"/>
+          <w:b/>
+          <w:bCs/>
+          <w:sz w:val="24"/>
+          <w:szCs w:val="24"/>
+        </w:rPr>
+        <w:t>Attrition by Salary Group:</w:t>
+      </w:r>
+      <w:r>
+        <w:rPr>
+          <w:rFonts w:ascii="Times New Roman" w:hAnsi="Times New Roman" w:cs="Times New Roman"/>
+          <w:sz w:val="24"/>
+          <w:szCs w:val="24"/>
+        </w:rPr>
+        <w:t xml:space="preserve"> The low-salary group had the highest observed attrition rate at 29.27%, while the very-high-salary group had a rate of 10.33%. This pattern suggests that compensation and salary progression may be relevant when examining employee retention.</w:t>
+      </w:r>
+    </w:p>
+    <w:p>
+      <w:pPr>
+        <w:spacing w:after="0" w:line="240" w:lineRule="auto"/>
+        <w:jc w:val="both"/>
+        <w:rPr>
+          <w:rFonts w:ascii="Times New Roman" w:hAnsi="Times New Roman" w:cs="Times New Roman"/>
+          <w:sz w:val="24"/>
+          <w:szCs w:val="24"/>
+        </w:rPr>
+      </w:pPr>
+      <w:r>
+        <w:rPr>
+          <w:rFonts w:ascii="Times New Roman" w:hAnsi="Times New Roman" w:cs="Times New Roman"/>
+          <w:b/>
+          <w:bCs/>
+          <w:sz w:val="24"/>
+          <w:szCs w:val="24"/>
+        </w:rPr>
+        <w:t>Attrition by Age Group:</w:t>
+      </w:r>
+      <w:r>
+        <w:rPr>
+          <w:rFonts w:ascii="Times New Roman" w:hAnsi="Times New Roman" w:cs="Times New Roman"/>
+          <w:sz w:val="24"/>
+          <w:szCs w:val="24"/>
+        </w:rPr>
+        <w:t xml:space="preserve"> Employees aged 25 or below had the highest observed attrition rate at 35.77%, while employees aged 36–45 had the lowest at 9.19%. This suggests that early-career employees may benefit from further investigation into onboarding, mentoring and career development.</w:t>
+      </w:r>
+    </w:p>
+    <w:p>
+      <w:pPr>
+        <w:spacing w:after="0" w:line="240" w:lineRule="auto"/>
+        <w:jc w:val="both"/>
+        <w:rPr>
+          <w:rFonts w:ascii="Times New Roman" w:hAnsi="Times New Roman" w:cs="Times New Roman"/>
+          <w:sz w:val="24"/>
+          <w:szCs w:val="24"/>
+        </w:rPr>
+      </w:pPr>
+      <w:r>
+        <w:rPr>
+          <w:rFonts w:ascii="Times New Roman" w:hAnsi="Times New Roman" w:cs="Times New Roman"/>
+          <w:b/>
+          <w:bCs/>
+          <w:sz w:val="24"/>
+          <w:szCs w:val="24"/>
+        </w:rPr>
+        <w:t>Attrition by Job Role:</w:t>
+      </w:r>
+      <w:r>
+        <w:rPr>
+          <w:rFonts w:ascii="Times New Roman" w:hAnsi="Times New Roman" w:cs="Times New Roman"/>
+          <w:sz w:val="24"/>
+          <w:szCs w:val="24"/>
+        </w:rPr>
+        <w:t xml:space="preserve"> Sales Representatives had the highest observed attrition rate at 39.76%, followed by Laboratory Technicians at 23.94% and Human Resources employees at 23.08%. Research Directors had the lowest rate at 2.50%. These differences suggest that retention challenges may vary according to job responsibilities and working conditions. Group sizes should also be considered when interpreting these rates.</w:t>
+      </w:r>
+    </w:p>
+    <w:p>
+      <w:pPr>
+        <w:spacing w:after="0" w:line="240" w:lineRule="auto"/>
+        <w:jc w:val="both"/>
+        <w:rPr>
+          <w:rFonts w:ascii="Times New Roman" w:hAnsi="Times New Roman" w:cs="Times New Roman"/>
+          <w:sz w:val="24"/>
+          <w:szCs w:val="24"/>
+        </w:rPr>
+      </w:pPr>
+      <w:r>
+        <w:rPr>
+          <w:rFonts w:ascii="Times New Roman" w:hAnsi="Times New Roman" w:cs="Times New Roman"/>
+          <w:b/>
+          <w:bCs/>
+          <w:sz w:val="24"/>
+          <w:szCs w:val="24"/>
+        </w:rPr>
+        <w:t>Attrition by Business Travel:</w:t>
+      </w:r>
+      <w:r>
+        <w:rPr>
+          <w:rFonts w:ascii="Times New Roman" w:hAnsi="Times New Roman" w:cs="Times New Roman"/>
+          <w:sz w:val="24"/>
+          <w:szCs w:val="24"/>
+        </w:rPr>
+        <w:t xml:space="preserve"> Employees who travelled frequently had an observed attrition rate of 24.91%, compared with 14.96% among employees who travelled rarely and 8.00% among employees who did not travel. Travel demands may be worth examining alongside workload and job requirements.</w:t>
+      </w:r>
+    </w:p>
+    <w:p>
+      <w:pPr>
+        <w:spacing w:after="0" w:line="240" w:lineRule="auto"/>
+        <w:jc w:val="both"/>
+        <w:rPr>
+          <w:rFonts w:ascii="Times New Roman" w:hAnsi="Times New Roman" w:cs="Times New Roman"/>
+          <w:sz w:val="24"/>
+          <w:szCs w:val="24"/>
+        </w:rPr>
+      </w:pPr>
+      <w:r>
+        <w:rPr>
+          <w:rFonts w:ascii="Times New Roman" w:hAnsi="Times New Roman" w:cs="Times New Roman"/>
+          <w:b/>
+          <w:bCs/>
+          <w:sz w:val="24"/>
+          <w:szCs w:val="24"/>
+        </w:rPr>
+        <w:t xml:space="preserve">Attrition by Job Satisfaction: </w:t>
+      </w:r>
+      <w:r>
+        <w:rPr>
+          <w:rFonts w:ascii="Times New Roman" w:hAnsi="Times New Roman" w:cs="Times New Roman"/>
+          <w:sz w:val="24"/>
+          <w:szCs w:val="24"/>
+        </w:rPr>
+        <w:t>Employees with a job satisfaction score of 1 had an attrition rate of 22.84%, compared with 11.33% for those with a score of 4. This generally suggests an association between lower job satisfaction and higher attrition, although the middle categories do not follow a perfectly consistent trend.</w:t>
+      </w:r>
+    </w:p>
+    <w:p>
+      <w:pPr>
+        <w:spacing w:after="0" w:line="240" w:lineRule="auto"/>
+        <w:jc w:val="both"/>
+        <w:rPr>
+          <w:rFonts w:ascii="Times New Roman" w:hAnsi="Times New Roman" w:cs="Times New Roman"/>
+          <w:sz w:val="24"/>
+          <w:szCs w:val="24"/>
+        </w:rPr>
+      </w:pPr>
+    </w:p>
+    <w:p>
+      <w:pPr>
+        <w:spacing w:after="0" w:line="240" w:lineRule="auto"/>
+        <w:jc w:val="both"/>
+        <w:rPr>
+          <w:rFonts w:ascii="Times New Roman" w:hAnsi="Times New Roman" w:cs="Times New Roman"/>
+          <w:sz w:val="24"/>
+          <w:szCs w:val="24"/>
+        </w:rPr>
+      </w:pPr>
+      <w:r>
+        <w:rPr>
+          <w:rFonts w:ascii="Times New Roman" w:hAnsi="Times New Roman" w:cs="Times New Roman"/>
+          <w:b/>
+          <w:bCs/>
+          <w:sz w:val="24"/>
+          <w:szCs w:val="24"/>
+        </w:rPr>
+        <w:lastRenderedPageBreak/>
+        <w:t>Attrition by Work-Life Balance:</w:t>
+      </w:r>
+      <w:r>
+        <w:rPr>
+          <w:rFonts w:ascii="Times New Roman" w:hAnsi="Times New Roman" w:cs="Times New Roman"/>
+          <w:sz w:val="24"/>
+          <w:szCs w:val="24"/>
+        </w:rPr>
+        <w:t xml:space="preserve"> Employees with the lowest work-life balance rating had the highest observed attrition rate at 31.25%. However, the pattern is not perfectly linear, so work-life balance should be considered alongside other factors rather than treated as the sole explanation for attrition.</w:t>
+      </w:r>
+    </w:p>
+    <w:p>
+      <w:pPr>
+        <w:spacing w:line="240" w:lineRule="auto"/>
+        <w:jc w:val="both"/>
+        <w:rPr>
+          <w:rFonts w:ascii="Times New Roman" w:hAnsi="Times New Roman" w:cs="Times New Roman"/>
+          <w:b/>
+          <w:sz w:val="28"/>
+          <w:szCs w:val="28"/>
+        </w:rPr>
+      </w:pPr>
+      <w:r>
+        <w:rPr>
+          <w:rFonts w:ascii="Times New Roman" w:hAnsi="Times New Roman" w:cs="Times New Roman"/>
+          <w:b/>
+          <w:sz w:val="28"/>
+          <w:szCs w:val="28"/>
+        </w:rPr>
+        <w:t>3. Overall Dashboard Insight</w:t>
+      </w:r>
+    </w:p>
+    <w:p>
+      <w:pPr>
+        <w:spacing w:line="240" w:lineRule="auto"/>
+        <w:jc w:val="both"/>
+        <w:rPr>
+          <w:rFonts w:ascii="Times New Roman" w:hAnsi="Times New Roman" w:cs="Times New Roman"/>
+          <w:sz w:val="24"/>
+          <w:szCs w:val="24"/>
+        </w:rPr>
+      </w:pPr>
+      <w:r>
+        <w:rPr>
+          <w:rFonts w:ascii="Times New Roman" w:hAnsi="Times New Roman" w:cs="Times New Roman"/>
+          <w:sz w:val="24"/>
+          <w:szCs w:val="24"/>
+        </w:rPr>
+        <w:t>The dashboard indicates that employee attrition differs across overtime status, salary groups, age groups, departments, job roles, business travel, job satisfaction and work-life balance. Overtime, younger age groups, lower salary groups and certain job roles show comparatively higher observed attrition rates. These patterns can help HR teams prioritize further investigation and develop targeted retention strategies.</w:t>
+      </w:r>
+    </w:p>
+    <w:p>
+      <w:pPr>
+        <w:spacing w:line="240" w:lineRule="auto"/>
+        <w:jc w:val="both"/>
+        <w:rPr>
+          <w:rFonts w:ascii="Times New Roman" w:hAnsi="Times New Roman" w:cs="Times New Roman"/>
+          <w:sz w:val="24"/>
+          <w:szCs w:val="24"/>
+        </w:rPr>
+      </w:pPr>
+      <w:r>
+        <w:rPr>
+          <w:rFonts w:ascii="Times New Roman" w:hAnsi="Times New Roman" w:cs="Times New Roman"/>
+          <w:sz w:val="24"/>
+          <w:szCs w:val="24"/>
+        </w:rPr>
+        <w:t>Interpretation note: The dashboard shows associations and descriptive patterns within the available dataset. It does not establish that any single factor directly causes employee attrition. Group sizes and other employee characteristics should be considered before making HR decisions.</w:t>
+      </w:r>
+    </w:p>
+    <w:p>
+      <w:pPr>
+        <w:spacing w:line="240" w:lineRule="auto"/>
+        <w:jc w:val="center"/>
+        <w:rPr>
+          <w:rFonts w:ascii="Times New Roman" w:hAnsi="Times New Roman" w:cs="Times New Roman"/>
+          <w:b/>
+          <w:bCs/>
+          <w:sz w:val="28"/>
+          <w:szCs w:val="28"/>
+        </w:rPr>
+      </w:pPr>
+      <w:r>
+        <w:rPr>
+          <w:rFonts w:ascii="Times New Roman" w:hAnsi="Times New Roman" w:cs="Times New Roman"/>
+          <w:b/>
+          <w:bCs/>
+          <w:sz w:val="28"/>
+          <w:szCs w:val="28"/>
+        </w:rPr>
         <w:t>Limitations</w:t>
       </w:r>
     </w:p>
@@ -8613,6 +9135,155 @@
     </w:lvl>
   </w:abstractNum>
   <w:abstractNum w:abstractNumId="2" w15:restartNumberingAfterBreak="0">
+    <w:nsid w:val="108313A5"/>
+    <w:multiLevelType w:val="multilevel"/>
+    <w:tmpl w:val="8E48E502"/>
+    <w:lvl w:ilvl="0">
+      <w:start w:val="1"/>
+      <w:numFmt w:val="bullet"/>
+      <w:lvlText w:val=""/>
+      <w:lvlJc w:val="left"/>
+      <w:pPr>
+        <w:tabs>
+          <w:tab w:val="num" w:pos="720"/>
+        </w:tabs>
+        <w:ind w:left="720" w:hanging="360"/>
+      </w:pPr>
+      <w:rPr>
+        <w:rFonts w:ascii="Symbol" w:hAnsi="Symbol" w:hint="default"/>
+        <w:sz w:val="20"/>
+      </w:rPr>
+    </w:lvl>
+    <w:lvl w:ilvl="1" w:tentative="1">
+      <w:start w:val="1"/>
+      <w:numFmt w:val="bullet"/>
+      <w:lvlText w:val="o"/>
+      <w:lvlJc w:val="left"/>
+      <w:pPr>
+        <w:tabs>
+          <w:tab w:val="num" w:pos="1440"/>
+        </w:tabs>
+        <w:ind w:left="1440" w:hanging="360"/>
+      </w:pPr>
+      <w:rPr>
+        <w:rFonts w:ascii="Courier New" w:hAnsi="Courier New" w:hint="default"/>
+        <w:sz w:val="20"/>
+      </w:rPr>
+    </w:lvl>
+    <w:lvl w:ilvl="2" w:tentative="1">
+      <w:start w:val="1"/>
+      <w:numFmt w:val="bullet"/>
+      <w:lvlText w:val=""/>
+      <w:lvlJc w:val="left"/>
+      <w:pPr>
+        <w:tabs>
+          <w:tab w:val="num" w:pos="2160"/>
+        </w:tabs>
+        <w:ind w:left="2160" w:hanging="360"/>
+      </w:pPr>
+      <w:rPr>
+        <w:rFonts w:ascii="Wingdings" w:hAnsi="Wingdings" w:hint="default"/>
+        <w:sz w:val="20"/>
+      </w:rPr>
+    </w:lvl>
+    <w:lvl w:ilvl="3" w:tentative="1">
+      <w:start w:val="1"/>
+      <w:numFmt w:val="bullet"/>
+      <w:lvlText w:val=""/>
+      <w:lvlJc w:val="left"/>
+      <w:pPr>
+        <w:tabs>
+          <w:tab w:val="num" w:pos="2880"/>
+        </w:tabs>
+        <w:ind w:left="2880" w:hanging="360"/>
+      </w:pPr>
+      <w:rPr>
+        <w:rFonts w:ascii="Wingdings" w:hAnsi="Wingdings" w:hint="default"/>
+        <w:sz w:val="20"/>
+      </w:rPr>
+    </w:lvl>
+    <w:lvl w:ilvl="4" w:tentative="1">
+      <w:start w:val="1"/>
+      <w:numFmt w:val="bullet"/>
+      <w:lvlText w:val=""/>
+      <w:lvlJc w:val="left"/>
+      <w:pPr>
+        <w:tabs>
+          <w:tab w:val="num" w:pos="3600"/>
+        </w:tabs>
+        <w:ind w:left="3600" w:hanging="360"/>
+      </w:pPr>
+      <w:rPr>
+        <w:rFonts w:ascii="Wingdings" w:hAnsi="Wingdings" w:hint="default"/>
+        <w:sz w:val="20"/>
+      </w:rPr>
+    </w:lvl>
+    <w:lvl w:ilvl="5" w:tentative="1">
+      <w:start w:val="1"/>
+      <w:numFmt w:val="bullet"/>
+      <w:lvlText w:val=""/>
+      <w:lvlJc w:val="left"/>
+      <w:pPr>
+        <w:tabs>
+          <w:tab w:val="num" w:pos="4320"/>
+        </w:tabs>
+        <w:ind w:left="4320" w:hanging="360"/>
+      </w:pPr>
+      <w:rPr>
+        <w:rFonts w:ascii="Wingdings" w:hAnsi="Wingdings" w:hint="default"/>
+        <w:sz w:val="20"/>
+      </w:rPr>
+    </w:lvl>
+    <w:lvl w:ilvl="6" w:tentative="1">
+      <w:start w:val="1"/>
+      <w:numFmt w:val="bullet"/>
+      <w:lvlText w:val=""/>
+      <w:lvlJc w:val="left"/>
+      <w:pPr>
+        <w:tabs>
+          <w:tab w:val="num" w:pos="5040"/>
+        </w:tabs>
+        <w:ind w:left="5040" w:hanging="360"/>
+      </w:pPr>
+      <w:rPr>
+        <w:rFonts w:ascii="Wingdings" w:hAnsi="Wingdings" w:hint="default"/>
+        <w:sz w:val="20"/>
+      </w:rPr>
+    </w:lvl>
+    <w:lvl w:ilvl="7" w:tentative="1">
+      <w:start w:val="1"/>
+      <w:numFmt w:val="bullet"/>
+      <w:lvlText w:val=""/>
+      <w:lvlJc w:val="left"/>
+      <w:pPr>
+        <w:tabs>
+          <w:tab w:val="num" w:pos="5760"/>
+        </w:tabs>
+        <w:ind w:left="5760" w:hanging="360"/>
+      </w:pPr>
+      <w:rPr>
+        <w:rFonts w:ascii="Wingdings" w:hAnsi="Wingdings" w:hint="default"/>
+        <w:sz w:val="20"/>
+      </w:rPr>
+    </w:lvl>
+    <w:lvl w:ilvl="8" w:tentative="1">
+      <w:start w:val="1"/>
+      <w:numFmt w:val="bullet"/>
+      <w:lvlText w:val=""/>
+      <w:lvlJc w:val="left"/>
+      <w:pPr>
+        <w:tabs>
+          <w:tab w:val="num" w:pos="6480"/>
+        </w:tabs>
+        <w:ind w:left="6480" w:hanging="360"/>
+      </w:pPr>
+      <w:rPr>
+        <w:rFonts w:ascii="Wingdings" w:hAnsi="Wingdings" w:hint="default"/>
+        <w:sz w:val="20"/>
+      </w:rPr>
+    </w:lvl>
+  </w:abstractNum>
+  <w:abstractNum w:abstractNumId="3" w15:restartNumberingAfterBreak="0">
     <w:nsid w:val="13B81CB1"/>
     <w:multiLevelType w:val="multilevel"/>
     <w:tmpl w:val="D5B885E4"/>
@@ -8761,7 +9432,7 @@
       </w:rPr>
     </w:lvl>
   </w:abstractNum>
-  <w:abstractNum w:abstractNumId="3" w15:restartNumberingAfterBreak="0">
+  <w:abstractNum w:abstractNumId="4" w15:restartNumberingAfterBreak="0">
     <w:nsid w:val="1A5F5871"/>
     <w:multiLevelType w:val="multilevel"/>
     <w:tmpl w:val="56927AA2"/>
@@ -8910,7 +9581,7 @@
       </w:rPr>
     </w:lvl>
   </w:abstractNum>
-  <w:abstractNum w:abstractNumId="4" w15:restartNumberingAfterBreak="0">
+  <w:abstractNum w:abstractNumId="5" w15:restartNumberingAfterBreak="0">
     <w:nsid w:val="2E2E68CD"/>
     <w:multiLevelType w:val="multilevel"/>
     <w:tmpl w:val="B3EE672E"/>
@@ -9059,7 +9730,7 @@
       </w:rPr>
     </w:lvl>
   </w:abstractNum>
-  <w:abstractNum w:abstractNumId="5" w15:restartNumberingAfterBreak="0">
+  <w:abstractNum w:abstractNumId="6" w15:restartNumberingAfterBreak="0">
     <w:nsid w:val="31140A33"/>
     <w:multiLevelType w:val="multilevel"/>
     <w:tmpl w:val="CDB670E6"/>
@@ -9208,7 +9879,7 @@
       </w:rPr>
     </w:lvl>
   </w:abstractNum>
-  <w:abstractNum w:abstractNumId="6" w15:restartNumberingAfterBreak="0">
+  <w:abstractNum w:abstractNumId="7" w15:restartNumberingAfterBreak="0">
     <w:nsid w:val="3F2D583D"/>
     <w:multiLevelType w:val="multilevel"/>
     <w:tmpl w:val="AE2A34CE"/>
@@ -9357,7 +10028,7 @@
       </w:rPr>
     </w:lvl>
   </w:abstractNum>
-  <w:abstractNum w:abstractNumId="7" w15:restartNumberingAfterBreak="0">
+  <w:abstractNum w:abstractNumId="8" w15:restartNumberingAfterBreak="0">
     <w:nsid w:val="4017683F"/>
     <w:multiLevelType w:val="multilevel"/>
     <w:tmpl w:val="EFAC5432"/>
@@ -9506,7 +10177,7 @@
       </w:rPr>
     </w:lvl>
   </w:abstractNum>
-  <w:abstractNum w:abstractNumId="8" w15:restartNumberingAfterBreak="0">
+  <w:abstractNum w:abstractNumId="9" w15:restartNumberingAfterBreak="0">
     <w:nsid w:val="4CD143AF"/>
     <w:multiLevelType w:val="multilevel"/>
     <w:tmpl w:val="942CC2B2"/>
@@ -9619,7 +10290,7 @@
       </w:pPr>
     </w:lvl>
   </w:abstractNum>
-  <w:abstractNum w:abstractNumId="9" w15:restartNumberingAfterBreak="0">
+  <w:abstractNum w:abstractNumId="10" w15:restartNumberingAfterBreak="0">
     <w:nsid w:val="58521CCA"/>
     <w:multiLevelType w:val="multilevel"/>
     <w:tmpl w:val="5296A468"/>
@@ -9768,7 +10439,7 @@
       </w:rPr>
     </w:lvl>
   </w:abstractNum>
-  <w:abstractNum w:abstractNumId="10" w15:restartNumberingAfterBreak="0">
+  <w:abstractNum w:abstractNumId="11" w15:restartNumberingAfterBreak="0">
     <w:nsid w:val="58630E19"/>
     <w:multiLevelType w:val="multilevel"/>
     <w:tmpl w:val="1E5614DA"/>
@@ -9917,7 +10588,7 @@
       </w:rPr>
     </w:lvl>
   </w:abstractNum>
-  <w:abstractNum w:abstractNumId="11" w15:restartNumberingAfterBreak="0">
+  <w:abstractNum w:abstractNumId="12" w15:restartNumberingAfterBreak="0">
     <w:nsid w:val="75F20F26"/>
     <w:multiLevelType w:val="multilevel"/>
     <w:tmpl w:val="9BC0B8EE"/>
@@ -10066,7 +10737,7 @@
       </w:rPr>
     </w:lvl>
   </w:abstractNum>
-  <w:abstractNum w:abstractNumId="12" w15:restartNumberingAfterBreak="0">
+  <w:abstractNum w:abstractNumId="13" w15:restartNumberingAfterBreak="0">
     <w:nsid w:val="7DBC57A4"/>
     <w:multiLevelType w:val="multilevel"/>
     <w:tmpl w:val="CBFE5F88"/>
@@ -10219,40 +10890,43 @@
     <w:abstractNumId w:val="1"/>
   </w:num>
   <w:num w:numId="2" w16cid:durableId="677657195">
+    <w:abstractNumId w:val="7"/>
+  </w:num>
+  <w:num w:numId="3" w16cid:durableId="1114440344">
     <w:abstractNumId w:val="6"/>
   </w:num>
-  <w:num w:numId="3" w16cid:durableId="1114440344">
+  <w:num w:numId="4" w16cid:durableId="1818718498">
     <w:abstractNumId w:val="5"/>
   </w:num>
-  <w:num w:numId="4" w16cid:durableId="1818718498">
-    <w:abstractNumId w:val="4"/>
+  <w:num w:numId="5" w16cid:durableId="2056158121">
+    <w:abstractNumId w:val="12"/>
   </w:num>
-  <w:num w:numId="5" w16cid:durableId="2056158121">
+  <w:num w:numId="6" w16cid:durableId="616104089">
     <w:abstractNumId w:val="11"/>
   </w:num>
-  <w:num w:numId="6" w16cid:durableId="616104089">
-    <w:abstractNumId w:val="10"/>
-  </w:num>
   <w:num w:numId="7" w16cid:durableId="2082360473">
-    <w:abstractNumId w:val="3"/>
+    <w:abstractNumId w:val="4"/>
   </w:num>
   <w:num w:numId="8" w16cid:durableId="1494956148">
     <w:abstractNumId w:val="0"/>
   </w:num>
   <w:num w:numId="9" w16cid:durableId="805858174">
-    <w:abstractNumId w:val="12"/>
+    <w:abstractNumId w:val="13"/>
   </w:num>
   <w:num w:numId="10" w16cid:durableId="1265268902">
-    <w:abstractNumId w:val="7"/>
+    <w:abstractNumId w:val="8"/>
   </w:num>
   <w:num w:numId="11" w16cid:durableId="2136633430">
-    <w:abstractNumId w:val="2"/>
+    <w:abstractNumId w:val="3"/>
   </w:num>
   <w:num w:numId="12" w16cid:durableId="1540360668">
+    <w:abstractNumId w:val="10"/>
+  </w:num>
+  <w:num w:numId="13" w16cid:durableId="1877160377">
     <w:abstractNumId w:val="9"/>
   </w:num>
-  <w:num w:numId="13" w16cid:durableId="1877160377">
-    <w:abstractNumId w:val="8"/>
+  <w:num w:numId="14" w16cid:durableId="391150208">
+    <w:abstractNumId w:val="2"/>
   </w:num>
 </w:numbering>
 </file>
@@ -10860,7 +11534,6 @@
   <w:style w:type="character" w:default="1" w:styleId="DefaultParagraphFont">
     <w:name w:val="Default Paragraph Font"/>
     <w:uiPriority w:val="1"/>
-    <w:semiHidden/>
     <w:unhideWhenUsed/>
   </w:style>
   <w:style w:type="table" w:default="1" w:styleId="TableNormal">

</xml_diff>